<commit_message>
Dernière version avant modification word
</commit_message>
<xml_diff>
--- a/App/Descriptif de ma BDD.docx
+++ b/App/Descriptif de ma BDD.docx
@@ -40,19 +40,7 @@
     </w:p>
     <w:p>
       <w:r>
-        <w:t xml:space="preserve">Je n’ai pas trop de détails mais je pense que c’est à </w:t>
-      </w:r>
-      <w:r>
-        <w:t>lier</w:t>
-      </w:r>
-      <w:r>
-        <w:t xml:space="preserve"> avec polyvalence ou alors ne pas la créer et se baser </w:t>
-      </w:r>
-      <w:r>
-        <w:t xml:space="preserve">directement </w:t>
-      </w:r>
-      <w:r>
-        <w:t xml:space="preserve">sur la table polyvalence. </w:t>
+        <w:t xml:space="preserve">Je n’ai pas trop de détails mais je pense que c’est à lier avec polyvalence ou alors ne pas la créer et se baser directement sur la table polyvalence. </w:t>
       </w:r>
     </w:p>
     <w:p>
@@ -99,184 +87,370 @@
         </w:numPr>
       </w:pPr>
       <w:r>
-        <w:t xml:space="preserve">Type de </w:t>
-      </w:r>
-      <w:r>
-        <w:t>contrat (</w:t>
-      </w:r>
-      <w:r>
-        <w:t xml:space="preserve">Cdi cdd apprentissage </w:t>
-      </w:r>
-      <w:r>
-        <w:t>professionnalisation</w:t>
-      </w:r>
+        <w:t xml:space="preserve">Type de contrat </w:t>
+      </w:r>
+    </w:p>
+    <w:p>
+      <w:pPr>
+        <w:pStyle w:val="Paragraphedeliste"/>
+        <w:numPr>
+          <w:ilvl w:val="1"/>
+          <w:numId w:val="1"/>
+        </w:numPr>
+      </w:pPr>
+      <w:r>
+        <w:t xml:space="preserve">Si Stagiaire : Nom du tuteur, Prénom du tuteur, Date de début, Date de fin, Ecole  </w:t>
+      </w:r>
+    </w:p>
+    <w:p>
+      <w:pPr>
+        <w:pStyle w:val="Paragraphedeliste"/>
+        <w:numPr>
+          <w:ilvl w:val="1"/>
+          <w:numId w:val="1"/>
+        </w:numPr>
+      </w:pPr>
+      <w:r>
+        <w:t xml:space="preserve">Si apprentissage : Nom du tuteur, Prénom du tuteur, Date de début, Ecole, Salaire </w:t>
+      </w:r>
+    </w:p>
+    <w:p>
+      <w:pPr>
+        <w:pStyle w:val="Paragraphedeliste"/>
+        <w:numPr>
+          <w:ilvl w:val="1"/>
+          <w:numId w:val="1"/>
+        </w:numPr>
+      </w:pPr>
+      <w:r>
+        <w:t>Si Intérimaire : Nom ETT, Adresse ETT, Salaire</w:t>
+      </w:r>
+    </w:p>
+    <w:p>
+      <w:pPr>
+        <w:pStyle w:val="Paragraphedeliste"/>
+        <w:numPr>
+          <w:ilvl w:val="1"/>
+          <w:numId w:val="1"/>
+        </w:numPr>
+      </w:pPr>
+      <w:r>
+        <w:t>Si Mise à disposition GE : Nom du GE, Adresse du GE, Salaire</w:t>
+      </w:r>
+    </w:p>
+    <w:p>
+      <w:pPr>
+        <w:pStyle w:val="Paragraphedeliste"/>
+        <w:numPr>
+          <w:ilvl w:val="1"/>
+          <w:numId w:val="1"/>
+        </w:numPr>
+      </w:pPr>
+      <w:r>
+        <w:t>Si étranger hors UE : Date d’autorisation de travail, Date de demande autorisation de travail, type de titre valant autorisation de travail, Numéro d’ordre, Date limite, Salaire</w:t>
+      </w:r>
+    </w:p>
+    <w:p>
+      <w:pPr>
+        <w:pStyle w:val="Paragraphedeliste"/>
+        <w:numPr>
+          <w:ilvl w:val="1"/>
+          <w:numId w:val="1"/>
+        </w:numPr>
+      </w:pPr>
+      <w:r>
+        <w:t xml:space="preserve">Temps partiel : Salaire </w:t>
+      </w:r>
+    </w:p>
+    <w:p>
+      <w:pPr>
+        <w:pStyle w:val="Paragraphedeliste"/>
+        <w:numPr>
+          <w:ilvl w:val="1"/>
+          <w:numId w:val="1"/>
+        </w:numPr>
+      </w:pPr>
+      <w:r>
+        <w:t>CDI : date de début, date de fin, Salaire</w:t>
+      </w:r>
+    </w:p>
+    <w:p>
+      <w:pPr>
+        <w:pStyle w:val="Paragraphedeliste"/>
+        <w:numPr>
+          <w:ilvl w:val="1"/>
+          <w:numId w:val="1"/>
+        </w:numPr>
+      </w:pPr>
+      <w:r>
+        <w:t>CDD : date de début, date de fin, Salaire</w:t>
+      </w:r>
+    </w:p>
+    <w:p>
+      <w:pPr>
+        <w:pStyle w:val="Paragraphedeliste"/>
+        <w:numPr>
+          <w:ilvl w:val="1"/>
+          <w:numId w:val="1"/>
+        </w:numPr>
+      </w:pPr>
+      <w:r>
+        <w:t xml:space="preserve">CIFRE : Date de début, date de fin, Salaire, Ecole  </w:t>
+      </w:r>
+    </w:p>
+    <w:p>
+      <w:pPr>
+        <w:pStyle w:val="Paragraphedeliste"/>
+        <w:numPr>
+          <w:ilvl w:val="0"/>
+          <w:numId w:val="1"/>
+        </w:numPr>
+      </w:pPr>
+      <w:r>
+        <w:t xml:space="preserve">ETP </w:t>
+      </w:r>
+    </w:p>
+    <w:p>
+      <w:pPr>
+        <w:pStyle w:val="Paragraphedeliste"/>
+        <w:numPr>
+          <w:ilvl w:val="0"/>
+          <w:numId w:val="1"/>
+        </w:numPr>
+      </w:pPr>
+      <w:r>
+        <w:t>Catégorie</w:t>
+      </w:r>
+    </w:p>
+    <w:p>
+      <w:pPr>
+        <w:pStyle w:val="Paragraphedeliste"/>
+        <w:numPr>
+          <w:ilvl w:val="1"/>
+          <w:numId w:val="1"/>
+        </w:numPr>
+      </w:pPr>
+      <w:r>
+        <w:t>Ouvrier</w:t>
+      </w:r>
+    </w:p>
+    <w:p>
+      <w:pPr>
+        <w:pStyle w:val="Paragraphedeliste"/>
+        <w:numPr>
+          <w:ilvl w:val="1"/>
+          <w:numId w:val="1"/>
+        </w:numPr>
+      </w:pPr>
+      <w:r>
+        <w:t>Ouvrier qualifié</w:t>
+      </w:r>
+    </w:p>
+    <w:p>
+      <w:pPr>
+        <w:pStyle w:val="Paragraphedeliste"/>
+        <w:numPr>
+          <w:ilvl w:val="1"/>
+          <w:numId w:val="1"/>
+        </w:numPr>
+      </w:pPr>
+      <w:r>
+        <w:t>Employé</w:t>
+      </w:r>
+    </w:p>
+    <w:p>
+      <w:pPr>
+        <w:pStyle w:val="Paragraphedeliste"/>
+        <w:numPr>
+          <w:ilvl w:val="1"/>
+          <w:numId w:val="1"/>
+        </w:numPr>
+      </w:pPr>
+      <w:r>
+        <w:t>Agent de maîtrise</w:t>
+      </w:r>
+    </w:p>
+    <w:p>
+      <w:pPr>
+        <w:pStyle w:val="Paragraphedeliste"/>
+        <w:numPr>
+          <w:ilvl w:val="1"/>
+          <w:numId w:val="1"/>
+        </w:numPr>
+      </w:pPr>
+      <w:r>
+        <w:t xml:space="preserve">Cadre </w:t>
+      </w:r>
+    </w:p>
+    <w:p>
+      <w:pPr>
+        <w:pStyle w:val="Paragraphedeliste"/>
+        <w:numPr>
+          <w:ilvl w:val="0"/>
+          <w:numId w:val="1"/>
+        </w:numPr>
+      </w:pPr>
+      <w:r>
+        <w:t xml:space="preserve">Emploi </w:t>
+      </w:r>
+    </w:p>
+    <w:p>
+      <w:pPr>
+        <w:pStyle w:val="Paragraphedeliste"/>
+        <w:numPr>
+          <w:ilvl w:val="0"/>
+          <w:numId w:val="1"/>
+        </w:numPr>
+      </w:pPr>
+      <w:r>
+        <w:t>Validité</w:t>
+      </w:r>
+    </w:p>
+    <w:p>
+      <w:pPr>
+        <w:pStyle w:val="Paragraphedeliste"/>
+        <w:numPr>
+          <w:ilvl w:val="1"/>
+          <w:numId w:val="1"/>
+        </w:numPr>
+      </w:pPr>
+      <w:r>
+        <w:t xml:space="preserve">RQTH (date_debut, date_fin, périodique, permanent, Taux_incapacité) </w:t>
+      </w:r>
+    </w:p>
+    <w:p>
+      <w:pPr>
+        <w:pStyle w:val="Paragraphedeliste"/>
+        <w:numPr>
+          <w:ilvl w:val="1"/>
+          <w:numId w:val="1"/>
+        </w:numPr>
+      </w:pPr>
+      <w:r>
+        <w:t xml:space="preserve">OETH </w:t>
+      </w:r>
+    </w:p>
+    <w:p>
+      <w:pPr>
+        <w:pStyle w:val="Paragraphedeliste"/>
+        <w:ind w:left="1440"/>
+      </w:pPr>
       <w:r>
         <w:t xml:space="preserve"> </w:t>
       </w:r>
-      <w:r>
-        <w:t>intérim</w:t>
-      </w:r>
-      <w:r>
-        <w:t xml:space="preserve"> CIFRE stage</w:t>
-      </w:r>
-      <w:r>
-        <w:t>)</w:t>
-      </w:r>
-      <w:r>
-        <w:t xml:space="preserve"> </w:t>
-      </w:r>
-    </w:p>
-    <w:p>
-      <w:pPr>
-        <w:pStyle w:val="Paragraphedeliste"/>
-        <w:numPr>
-          <w:ilvl w:val="1"/>
-          <w:numId w:val="1"/>
-        </w:numPr>
-      </w:pPr>
-      <w:r>
-        <w:t>Si Stagiaire</w:t>
-      </w:r>
-      <w:r>
-        <w:t xml:space="preserve"> </w:t>
-      </w:r>
-      <w:r>
-        <w:t>: Nom du tuteur, Prénom du tuteur</w:t>
-      </w:r>
-      <w:r>
-        <w:t>, Date de début, Date de fin</w:t>
-      </w:r>
-      <w:r>
-        <w:t xml:space="preserve">, Ecole </w:t>
-      </w:r>
-      <w:r>
-        <w:t xml:space="preserve"> </w:t>
-      </w:r>
-    </w:p>
-    <w:p>
-      <w:pPr>
-        <w:pStyle w:val="Paragraphedeliste"/>
-        <w:numPr>
-          <w:ilvl w:val="1"/>
-          <w:numId w:val="1"/>
-        </w:numPr>
-      </w:pPr>
-      <w:r>
-        <w:t>Si apprentissage : Nom du tuteur, Prénom du tuteur, Date de début, Ecole</w:t>
-      </w:r>
-      <w:r>
-        <w:t>, Salaire</w:t>
-      </w:r>
-      <w:r>
-        <w:t xml:space="preserve"> </w:t>
-      </w:r>
-    </w:p>
-    <w:p>
-      <w:pPr>
-        <w:pStyle w:val="Paragraphedeliste"/>
-        <w:numPr>
-          <w:ilvl w:val="1"/>
-          <w:numId w:val="1"/>
-        </w:numPr>
-      </w:pPr>
-      <w:r>
-        <w:t>Si Intérimaire : Nom ETT, Adresse ETT</w:t>
-      </w:r>
-    </w:p>
-    <w:p>
-      <w:pPr>
-        <w:pStyle w:val="Paragraphedeliste"/>
-        <w:numPr>
-          <w:ilvl w:val="1"/>
-          <w:numId w:val="1"/>
-        </w:numPr>
-      </w:pPr>
-      <w:r>
-        <w:t>Si Mise à disposition GE : Nom du GE, Adresse du GE</w:t>
-      </w:r>
-      <w:r>
-        <w:t>, Salaire</w:t>
-      </w:r>
-    </w:p>
-    <w:p>
-      <w:pPr>
-        <w:pStyle w:val="Paragraphedeliste"/>
-        <w:numPr>
-          <w:ilvl w:val="1"/>
-          <w:numId w:val="1"/>
-        </w:numPr>
-      </w:pPr>
-      <w:r>
-        <w:t>Si étranger hors UE : Date d’autorisation de travail, Date de demande autorisation de travail, type de titre valant autorisation de travail, Numéro d’ordre</w:t>
-      </w:r>
-      <w:r>
-        <w:t>, Date limite</w:t>
-      </w:r>
-    </w:p>
-    <w:p>
-      <w:pPr>
-        <w:pStyle w:val="Paragraphedeliste"/>
-        <w:numPr>
-          <w:ilvl w:val="1"/>
-          <w:numId w:val="1"/>
-        </w:numPr>
-      </w:pPr>
-      <w:r>
-        <w:t>Temps partiel</w:t>
-      </w:r>
-      <w:r>
-        <w:t>, Salaire</w:t>
-      </w:r>
-    </w:p>
-    <w:p>
-      <w:pPr>
-        <w:pStyle w:val="Paragraphedeliste"/>
-        <w:numPr>
-          <w:ilvl w:val="1"/>
-          <w:numId w:val="1"/>
-        </w:numPr>
-      </w:pPr>
-      <w:r>
-        <w:t>CDI : date de début</w:t>
-      </w:r>
-      <w:r>
-        <w:t>, Salaire</w:t>
-      </w:r>
-    </w:p>
-    <w:p>
-      <w:pPr>
-        <w:pStyle w:val="Paragraphedeliste"/>
-        <w:numPr>
-          <w:ilvl w:val="1"/>
-          <w:numId w:val="1"/>
-        </w:numPr>
-      </w:pPr>
-      <w:r>
-        <w:t>CDD : date de début, date de fin</w:t>
-      </w:r>
-      <w:r>
-        <w:t>, Salaire</w:t>
-      </w:r>
-    </w:p>
-    <w:p>
-      <w:pPr>
-        <w:pStyle w:val="Paragraphedeliste"/>
-        <w:numPr>
-          <w:ilvl w:val="1"/>
-          <w:numId w:val="1"/>
-        </w:numPr>
-      </w:pPr>
-      <w:r>
-        <w:t>CIFRE</w:t>
-      </w:r>
-      <w:r>
-        <w:t xml:space="preserve"> : Date de début, date de fin, </w:t>
-      </w:r>
-      <w:r>
-        <w:t>S</w:t>
-      </w:r>
-      <w:r>
-        <w:t>alaire, Ecole doctorat</w:t>
+    </w:p>
+    <w:p>
+      <w:pPr>
+        <w:pStyle w:val="Paragraphedeliste"/>
+      </w:pPr>
+    </w:p>
+    <w:p>
+      <w:pPr>
+        <w:pStyle w:val="Paragraphedeliste"/>
+      </w:pPr>
+    </w:p>
+    <w:p>
+      <w:pPr>
+        <w:rPr>
+          <w:b/>
+          <w:bCs/>
+        </w:rPr>
+      </w:pPr>
+      <w:r>
+        <w:rPr>
+          <w:b/>
+          <w:bCs/>
+        </w:rPr>
+        <w:t xml:space="preserve">Troisième table </w:t>
+      </w:r>
+      <w:r>
+        <w:rPr>
+          <w:b/>
+          <w:bCs/>
+          <w:u w:val="single"/>
+        </w:rPr>
+        <w:t>Formation</w:t>
+      </w:r>
+      <w:r>
+        <w:rPr>
+          <w:b/>
+          <w:bCs/>
+        </w:rPr>
+        <w:t xml:space="preserve"> :</w:t>
+      </w:r>
+    </w:p>
+    <w:p>
+      <w:pPr>
+        <w:rPr>
+          <w:b/>
+          <w:bCs/>
+        </w:rPr>
+      </w:pPr>
+    </w:p>
+    <w:p>
+      <w:pPr>
+        <w:rPr>
+          <w:b/>
+          <w:bCs/>
+        </w:rPr>
+      </w:pPr>
+    </w:p>
+    <w:p>
+      <w:pPr>
+        <w:rPr>
+          <w:b/>
+          <w:bCs/>
+        </w:rPr>
+      </w:pPr>
+    </w:p>
+    <w:p>
+      <w:pPr>
+        <w:rPr>
+          <w:b/>
+          <w:bCs/>
+        </w:rPr>
+      </w:pPr>
+    </w:p>
+    <w:p>
+      <w:pPr>
+        <w:rPr>
+          <w:b/>
+          <w:bCs/>
+        </w:rPr>
+      </w:pPr>
+    </w:p>
+    <w:p>
+      <w:pPr>
+        <w:rPr>
+          <w:b/>
+          <w:bCs/>
+        </w:rPr>
+      </w:pPr>
+    </w:p>
+    <w:p>
+      <w:r>
+        <w:rPr>
+          <w:b/>
+          <w:bCs/>
+        </w:rPr>
+        <w:lastRenderedPageBreak/>
+        <w:t xml:space="preserve">Quatrième table </w:t>
+      </w:r>
+      <w:r>
+        <w:rPr>
+          <w:b/>
+          <w:bCs/>
+          <w:u w:val="single"/>
+        </w:rPr>
+        <w:t>Congés</w:t>
+      </w:r>
+      <w:r>
+        <w:t xml:space="preserve"> : </w:t>
+      </w:r>
+    </w:p>
+    <w:p>
+      <w:r>
+        <w:t xml:space="preserve">Je pense que lier le type de contrat pourrait être pertinent pour calculer le droit à X congés pour l’employé. </w:t>
       </w:r>
     </w:p>
     <w:p>
@@ -288,7 +462,7 @@
         </w:numPr>
       </w:pPr>
       <w:r>
-        <w:t xml:space="preserve">Salaire </w:t>
+        <w:t>Date_debut</w:t>
       </w:r>
     </w:p>
     <w:p>
@@ -300,10 +474,7 @@
         </w:numPr>
       </w:pPr>
       <w:r>
-        <w:t>ETP</w:t>
-      </w:r>
-      <w:r>
-        <w:t xml:space="preserve"> </w:t>
+        <w:t>Date_fin</w:t>
       </w:r>
     </w:p>
     <w:p>
@@ -315,16 +486,7 @@
         </w:numPr>
       </w:pPr>
       <w:r>
-        <w:t>Catégorie</w:t>
-      </w:r>
-      <w:r>
-        <w:t xml:space="preserve"> ouvrier</w:t>
-      </w:r>
-      <w:r>
-        <w:t>/</w:t>
-      </w:r>
-      <w:r>
-        <w:t xml:space="preserve"> ouvrier qualifié employé agent de maitrise cadre </w:t>
+        <w:t>Restant (Pour celui-ci, il faudrait qu’il y soit écrit le nombre restant de congés à poser pour l’employé + prendre en compte les jours de congés mensuels s’il en a et les additionner s’il y a accumulation)</w:t>
       </w:r>
     </w:p>
     <w:p>
@@ -336,27 +498,61 @@
         </w:numPr>
       </w:pPr>
       <w:r>
-        <w:t xml:space="preserve">Emploi </w:t>
-      </w:r>
-    </w:p>
-    <w:p>
-      <w:pPr>
-        <w:pStyle w:val="Paragraphedeliste"/>
-      </w:pPr>
-    </w:p>
-    <w:p>
-      <w:pPr>
-        <w:rPr>
-          <w:b/>
-          <w:bCs/>
-        </w:rPr>
-      </w:pPr>
-      <w:r>
-        <w:rPr>
-          <w:b/>
-          <w:bCs/>
-        </w:rPr>
-        <w:t xml:space="preserve">Troisième table </w:t>
+        <w:t>Type_conges (CP, RTT, Sans solde, Maladie, Arrêt de Travail)</w:t>
+      </w:r>
+    </w:p>
+    <w:p>
+      <w:pPr>
+        <w:pStyle w:val="Paragraphedeliste"/>
+        <w:numPr>
+          <w:ilvl w:val="0"/>
+          <w:numId w:val="1"/>
+        </w:numPr>
+      </w:pPr>
+      <w:r>
+        <w:t xml:space="preserve">Statut (En attente, Validé, Refusé, En cours) </w:t>
+      </w:r>
+    </w:p>
+    <w:p/>
+    <w:p>
+      <w:r>
+        <w:t xml:space="preserve">Tanche d’âge </w:t>
+      </w:r>
+    </w:p>
+    <w:p>
+      <w:r>
+        <w:t xml:space="preserve">0 – 25 (- de 26ans) </w:t>
+      </w:r>
+    </w:p>
+    <w:p>
+      <w:r>
+        <w:t>26 – 45 (- de 46 ans)</w:t>
+      </w:r>
+    </w:p>
+    <w:p>
+      <w:r>
+        <w:t xml:space="preserve">46 – 54 (- de 55 ans) </w:t>
+      </w:r>
+    </w:p>
+    <w:p>
+      <w:r>
+        <w:t xml:space="preserve">55 et + </w:t>
+      </w:r>
+    </w:p>
+    <w:p/>
+    <w:p>
+      <w:pPr>
+        <w:rPr>
+          <w:b/>
+          <w:bCs/>
+        </w:rPr>
+      </w:pPr>
+      <w:r>
+        <w:rPr>
+          <w:b/>
+          <w:bCs/>
+        </w:rPr>
+        <w:t xml:space="preserve">Cinquième table </w:t>
       </w:r>
       <w:r>
         <w:rPr>
@@ -364,126 +560,87 @@
           <w:bCs/>
           <w:u w:val="single"/>
         </w:rPr>
-        <w:t>Formation</w:t>
-      </w:r>
-      <w:r>
-        <w:rPr>
-          <w:b/>
-          <w:bCs/>
-        </w:rPr>
-        <w:t xml:space="preserve"> :</w:t>
-      </w:r>
-    </w:p>
-    <w:p>
-      <w:pPr>
-        <w:rPr>
-          <w:b/>
-          <w:bCs/>
-        </w:rPr>
-      </w:pPr>
-    </w:p>
-    <w:p>
-      <w:r>
-        <w:rPr>
-          <w:b/>
-          <w:bCs/>
-        </w:rPr>
-        <w:t xml:space="preserve">Quatrième table </w:t>
-      </w:r>
-      <w:r>
-        <w:rPr>
-          <w:b/>
-          <w:bCs/>
-          <w:u w:val="single"/>
-        </w:rPr>
-        <w:t>Congés</w:t>
-      </w:r>
-      <w:r>
-        <w:t xml:space="preserve"> : </w:t>
-      </w:r>
-    </w:p>
-    <w:p>
-      <w:r>
-        <w:t xml:space="preserve">Tanche d’âge </w:t>
-      </w:r>
-    </w:p>
-    <w:p>
-      <w:r>
-        <w:t xml:space="preserve">0 – 25 </w:t>
-      </w:r>
-      <w:r>
-        <w:t xml:space="preserve">(- de 26ans) </w:t>
-      </w:r>
-    </w:p>
-    <w:p>
-      <w:r>
-        <w:t xml:space="preserve">26 – 45 </w:t>
-      </w:r>
-      <w:r>
-        <w:t>(- de 46 ans)</w:t>
-      </w:r>
-    </w:p>
-    <w:p>
-      <w:r>
-        <w:t>46 – 54</w:t>
-      </w:r>
-      <w:r>
-        <w:t xml:space="preserve"> (- de 55 ans) </w:t>
-      </w:r>
-    </w:p>
-    <w:p>
-      <w:r>
-        <w:t xml:space="preserve">55 et + </w:t>
-      </w:r>
+        <w:t>Déclaration</w:t>
+      </w:r>
+      <w:r>
+        <w:rPr>
+          <w:b/>
+          <w:bCs/>
+        </w:rPr>
+        <w:t> :</w:t>
+      </w:r>
+    </w:p>
+    <w:p>
+      <w:r>
+        <w:t xml:space="preserve">Information à récupérer en fonction du matricule de l’opérateur pour l’identifier </w:t>
+      </w:r>
+    </w:p>
+    <w:p>
+      <w:pPr>
+        <w:pStyle w:val="Paragraphedeliste"/>
+        <w:numPr>
+          <w:ilvl w:val="0"/>
+          <w:numId w:val="1"/>
+        </w:numPr>
+      </w:pPr>
+      <w:r>
+        <w:t xml:space="preserve">Absence </w:t>
+      </w:r>
+    </w:p>
+    <w:p>
+      <w:pPr>
+        <w:pStyle w:val="Paragraphedeliste"/>
+        <w:numPr>
+          <w:ilvl w:val="0"/>
+          <w:numId w:val="1"/>
+        </w:numPr>
+      </w:pPr>
+      <w:r>
+        <w:t xml:space="preserve">Arrêt Maladie </w:t>
+      </w:r>
+    </w:p>
+    <w:p>
+      <w:pPr>
+        <w:pStyle w:val="Paragraphedeliste"/>
+        <w:numPr>
+          <w:ilvl w:val="0"/>
+          <w:numId w:val="1"/>
+        </w:numPr>
+      </w:pPr>
+      <w:r>
+        <w:t xml:space="preserve">Accident de travail </w:t>
+      </w:r>
+    </w:p>
+    <w:p>
+      <w:pPr>
+        <w:pStyle w:val="Paragraphedeliste"/>
+        <w:numPr>
+          <w:ilvl w:val="0"/>
+          <w:numId w:val="1"/>
+        </w:numPr>
+      </w:pPr>
+      <w:r>
+        <w:t>Date_debut</w:t>
+      </w:r>
+    </w:p>
+    <w:p>
+      <w:pPr>
+        <w:pStyle w:val="Paragraphedeliste"/>
+        <w:numPr>
+          <w:ilvl w:val="0"/>
+          <w:numId w:val="1"/>
+        </w:numPr>
+      </w:pPr>
+      <w:r>
+        <w:t>Date_fin</w:t>
+      </w:r>
+    </w:p>
+    <w:p>
+      <w:pPr>
+        <w:pStyle w:val="Paragraphedeliste"/>
+      </w:pPr>
     </w:p>
     <w:p/>
-    <w:p>
-      <w:pPr>
-        <w:rPr>
-          <w:b/>
-          <w:bCs/>
-        </w:rPr>
-      </w:pPr>
-      <w:r>
-        <w:rPr>
-          <w:b/>
-          <w:bCs/>
-        </w:rPr>
-        <w:t xml:space="preserve">Cinquième table </w:t>
-      </w:r>
-      <w:r>
-        <w:rPr>
-          <w:b/>
-          <w:bCs/>
-          <w:u w:val="single"/>
-        </w:rPr>
-        <w:t>Déclaration</w:t>
-      </w:r>
-      <w:r>
-        <w:rPr>
-          <w:b/>
-          <w:bCs/>
-        </w:rPr>
-        <w:t xml:space="preserve"> : </w:t>
-      </w:r>
-    </w:p>
-    <w:p/>
-    <w:p>
-      <w:pPr>
-        <w:rPr>
-          <w:b/>
-          <w:bCs/>
-          <w:u w:val="single"/>
-        </w:rPr>
-      </w:pPr>
-      <w:r>
-        <w:rPr>
-          <w:b/>
-          <w:bCs/>
-        </w:rPr>
-        <w:t xml:space="preserve"> </w:t>
-      </w:r>
-    </w:p>
     <w:sectPr>
       <w:pgSz w:w="11906" w:h="16838"/>
       <w:pgMar w:top="1417" w:right="1417" w:bottom="1417" w:left="1417" w:header="708" w:footer="708" w:gutter="0"/>
@@ -1012,6 +1169,7 @@
   <w:style w:type="paragraph" w:default="1" w:styleId="Normal">
     <w:name w:val="Normal"/>
     <w:qFormat/>
+    <w:rsid w:val="0054316D"/>
   </w:style>
   <w:style w:type="character" w:default="1" w:styleId="Policepardfaut">
     <w:name w:val="Default Paragraph Font"/>

</xml_diff>